<commit_message>
file and folder structure
</commit_message>
<xml_diff>
--- a/src/assets/documents/Angular-theory.docx
+++ b/src/assets/documents/Angular-theory.docx
@@ -118,6 +118,549 @@
     <w:p>
       <w:r>
         <w:t>A Single Page Application (SPA) is a web application, which has only one html page. When we navigate around, only the content of the HTML page changes. The page itself never changes.</w:t>
+      </w:r>
+    </w:p>
+    <w:p>
+      <w:pPr>
+        <w:pStyle w:val="ListParagraph"/>
+        <w:numPr>
+          <w:ilvl w:val="0"/>
+          <w:numId w:val="1"/>
+        </w:numPr>
+        <w:rPr>
+          <w:b/>
+          <w:bCs/>
+          <w:color w:val="FF0000"/>
+        </w:rPr>
+      </w:pPr>
+      <w:r>
+        <w:rPr>
+          <w:b/>
+          <w:bCs/>
+          <w:color w:val="FF0000"/>
+        </w:rPr>
+        <w:t>What is the command to check the node version?</w:t>
+      </w:r>
+    </w:p>
+    <w:p>
+      <w:pPr>
+        <w:ind w:left="1440"/>
+      </w:pPr>
+      <w:r>
+        <w:t>Command: node -v</w:t>
+      </w:r>
+    </w:p>
+    <w:p>
+      <w:pPr>
+        <w:pStyle w:val="ListParagraph"/>
+        <w:numPr>
+          <w:ilvl w:val="0"/>
+          <w:numId w:val="1"/>
+        </w:numPr>
+        <w:rPr>
+          <w:b/>
+          <w:bCs/>
+          <w:color w:val="FF0000"/>
+        </w:rPr>
+      </w:pPr>
+      <w:r>
+        <w:rPr>
+          <w:b/>
+          <w:bCs/>
+          <w:color w:val="FF0000"/>
+        </w:rPr>
+        <w:t>What is the command to check the npm version?</w:t>
+      </w:r>
+    </w:p>
+    <w:p>
+      <w:pPr>
+        <w:ind w:left="1440"/>
+      </w:pPr>
+      <w:r>
+        <w:t>Command: npm -v</w:t>
+      </w:r>
+    </w:p>
+    <w:p>
+      <w:pPr>
+        <w:pStyle w:val="ListParagraph"/>
+        <w:numPr>
+          <w:ilvl w:val="0"/>
+          <w:numId w:val="1"/>
+        </w:numPr>
+        <w:rPr>
+          <w:b/>
+          <w:bCs/>
+          <w:color w:val="FF0000"/>
+        </w:rPr>
+      </w:pPr>
+      <w:r>
+        <w:rPr>
+          <w:b/>
+          <w:bCs/>
+          <w:color w:val="FF0000"/>
+        </w:rPr>
+        <w:t>What is the command to install angular cli in our machine?</w:t>
+      </w:r>
+    </w:p>
+    <w:p>
+      <w:pPr>
+        <w:ind w:left="1440"/>
+      </w:pPr>
+      <w:r>
+        <w:t>Command: npm install -global @angular/cli@latest</w:t>
+      </w:r>
+    </w:p>
+    <w:p>
+      <w:pPr>
+        <w:pStyle w:val="ListParagraph"/>
+        <w:numPr>
+          <w:ilvl w:val="0"/>
+          <w:numId w:val="1"/>
+        </w:numPr>
+        <w:rPr>
+          <w:b/>
+          <w:bCs/>
+          <w:color w:val="FF0000"/>
+        </w:rPr>
+      </w:pPr>
+      <w:r>
+        <w:rPr>
+          <w:b/>
+          <w:bCs/>
+          <w:color w:val="FF0000"/>
+        </w:rPr>
+        <w:t>What is the command to check the angular version?</w:t>
+      </w:r>
+    </w:p>
+    <w:p>
+      <w:pPr>
+        <w:ind w:left="1440"/>
+      </w:pPr>
+      <w:r>
+        <w:t>Command: ng v</w:t>
+      </w:r>
+    </w:p>
+    <w:p>
+      <w:pPr>
+        <w:pStyle w:val="ListParagraph"/>
+        <w:numPr>
+          <w:ilvl w:val="0"/>
+          <w:numId w:val="1"/>
+        </w:numPr>
+        <w:rPr>
+          <w:b/>
+          <w:bCs/>
+          <w:color w:val="FF0000"/>
+        </w:rPr>
+      </w:pPr>
+      <w:r>
+        <w:rPr>
+          <w:b/>
+          <w:bCs/>
+          <w:color w:val="FF0000"/>
+        </w:rPr>
+        <w:t>What is the command to create a new angular project?</w:t>
+      </w:r>
+    </w:p>
+    <w:p>
+      <w:pPr>
+        <w:ind w:left="1440"/>
+      </w:pPr>
+      <w:r>
+        <w:t>Command: ng new &lt;project_name&gt;</w:t>
+      </w:r>
+    </w:p>
+    <w:p>
+      <w:pPr>
+        <w:pStyle w:val="ListParagraph"/>
+        <w:numPr>
+          <w:ilvl w:val="0"/>
+          <w:numId w:val="1"/>
+        </w:numPr>
+        <w:rPr>
+          <w:b/>
+          <w:bCs/>
+          <w:color w:val="FF0000"/>
+        </w:rPr>
+      </w:pPr>
+      <w:r>
+        <w:rPr>
+          <w:b/>
+          <w:bCs/>
+          <w:color w:val="FF0000"/>
+        </w:rPr>
+        <w:t>What is the command to run the angular application?</w:t>
+      </w:r>
+    </w:p>
+    <w:p>
+      <w:pPr>
+        <w:ind w:left="1440"/>
+      </w:pPr>
+      <w:r>
+        <w:t>Command: ng serve</w:t>
+      </w:r>
+    </w:p>
+    <w:p>
+      <w:pPr>
+        <w:pStyle w:val="ListParagraph"/>
+        <w:numPr>
+          <w:ilvl w:val="0"/>
+          <w:numId w:val="1"/>
+        </w:numPr>
+        <w:rPr>
+          <w:b/>
+          <w:bCs/>
+          <w:color w:val="FF0000"/>
+        </w:rPr>
+      </w:pPr>
+      <w:r>
+        <w:rPr>
+          <w:b/>
+          <w:bCs/>
+          <w:color w:val="FF0000"/>
+        </w:rPr>
+        <w:t>What is the default port to run the angular application?</w:t>
+      </w:r>
+    </w:p>
+    <w:p>
+      <w:pPr>
+        <w:ind w:left="2160"/>
+        <w:rPr>
+          <w:b/>
+          <w:bCs/>
+        </w:rPr>
+      </w:pPr>
+      <w:r>
+        <w:rPr>
+          <w:b/>
+          <w:bCs/>
+        </w:rPr>
+        <w:t>4200</w:t>
+      </w:r>
+    </w:p>
+    <w:p>
+      <w:pPr>
+        <w:pStyle w:val="ListParagraph"/>
+        <w:numPr>
+          <w:ilvl w:val="0"/>
+          <w:numId w:val="1"/>
+        </w:numPr>
+        <w:rPr>
+          <w:b/>
+          <w:bCs/>
+          <w:color w:val="FF0000"/>
+        </w:rPr>
+      </w:pPr>
+      <w:r>
+        <w:rPr>
+          <w:b/>
+          <w:bCs/>
+          <w:color w:val="FF0000"/>
+        </w:rPr>
+        <w:t>What are the bundles will generate while building the angular application?</w:t>
+      </w:r>
+    </w:p>
+    <w:p>
+      <w:pPr>
+        <w:pStyle w:val="ListParagraph"/>
+        <w:numPr>
+          <w:ilvl w:val="0"/>
+          <w:numId w:val="2"/>
+        </w:numPr>
+      </w:pPr>
+      <w:r>
+        <w:t>Vendor.js</w:t>
+      </w:r>
+    </w:p>
+    <w:p>
+      <w:pPr>
+        <w:pStyle w:val="ListParagraph"/>
+        <w:numPr>
+          <w:ilvl w:val="0"/>
+          <w:numId w:val="2"/>
+        </w:numPr>
+      </w:pPr>
+      <w:r>
+        <w:t>Polyfils.js</w:t>
+      </w:r>
+    </w:p>
+    <w:p>
+      <w:pPr>
+        <w:pStyle w:val="ListParagraph"/>
+        <w:numPr>
+          <w:ilvl w:val="0"/>
+          <w:numId w:val="2"/>
+        </w:numPr>
+      </w:pPr>
+      <w:r>
+        <w:t>Styles.css, styles.js</w:t>
+      </w:r>
+    </w:p>
+    <w:p>
+      <w:pPr>
+        <w:pStyle w:val="ListParagraph"/>
+        <w:numPr>
+          <w:ilvl w:val="0"/>
+          <w:numId w:val="2"/>
+        </w:numPr>
+      </w:pPr>
+      <w:r>
+        <w:t>Main.js</w:t>
+      </w:r>
+    </w:p>
+    <w:p>
+      <w:pPr>
+        <w:pStyle w:val="ListParagraph"/>
+        <w:numPr>
+          <w:ilvl w:val="0"/>
+          <w:numId w:val="2"/>
+        </w:numPr>
+      </w:pPr>
+      <w:r>
+        <w:t>Runtime.js</w:t>
+      </w:r>
+    </w:p>
+    <w:p/>
+    <w:p/>
+    <w:p/>
+    <w:p>
+      <w:pPr>
+        <w:jc w:val="center"/>
+        <w:rPr>
+          <w:b/>
+          <w:bCs/>
+          <w:color w:val="7030A0"/>
+          <w:sz w:val="36"/>
+          <w:szCs w:val="36"/>
+          <w:u w:val="single"/>
+        </w:rPr>
+      </w:pPr>
+      <w:r>
+        <w:rPr>
+          <w:b/>
+          <w:bCs/>
+          <w:color w:val="7030A0"/>
+          <w:sz w:val="36"/>
+          <w:szCs w:val="36"/>
+          <w:u w:val="single"/>
+        </w:rPr>
+        <w:lastRenderedPageBreak/>
+        <w:t>Files and folder structure of an Angular Application</w:t>
+      </w:r>
+    </w:p>
+    <w:p>
+      <w:pPr>
+        <w:jc w:val="center"/>
+        <w:rPr>
+          <w:b/>
+          <w:bCs/>
+          <w:color w:val="7030A0"/>
+          <w:sz w:val="36"/>
+          <w:szCs w:val="36"/>
+          <w:u w:val="single"/>
+        </w:rPr>
+      </w:pPr>
+    </w:p>
+    <w:p>
+      <w:pPr>
+        <w:pStyle w:val="ListParagraph"/>
+        <w:numPr>
+          <w:ilvl w:val="0"/>
+          <w:numId w:val="1"/>
+        </w:numPr>
+        <w:rPr>
+          <w:b/>
+          <w:bCs/>
+          <w:color w:val="FF0000"/>
+        </w:rPr>
+      </w:pPr>
+      <w:r>
+        <w:rPr>
+          <w:b/>
+          <w:bCs/>
+          <w:color w:val="FF0000"/>
+        </w:rPr>
+        <w:t>Package.json file</w:t>
+      </w:r>
+    </w:p>
+    <w:p>
+      <w:r>
+        <w:t>The package.json file contains all the third party dependencies which are useful to run an angular application.</w:t>
+      </w:r>
+    </w:p>
+    <w:p>
+      <w:pPr>
+        <w:pStyle w:val="ListParagraph"/>
+        <w:numPr>
+          <w:ilvl w:val="0"/>
+          <w:numId w:val="1"/>
+        </w:numPr>
+        <w:rPr>
+          <w:b/>
+          <w:bCs/>
+          <w:color w:val="FF0000"/>
+        </w:rPr>
+      </w:pPr>
+      <w:r>
+        <w:rPr>
+          <w:b/>
+          <w:bCs/>
+          <w:color w:val="FF0000"/>
+        </w:rPr>
+        <w:t>What is the difference between dependencies and dev dependencies in package.json file?</w:t>
+      </w:r>
+    </w:p>
+    <w:p>
+      <w:r>
+        <w:t>The dependencies section is related to the angular application directly depends on these libraries but the dev dependencies the application uses these libraries wile developing the application.</w:t>
+      </w:r>
+    </w:p>
+    <w:p>
+      <w:pPr>
+        <w:pStyle w:val="ListParagraph"/>
+        <w:numPr>
+          <w:ilvl w:val="0"/>
+          <w:numId w:val="1"/>
+        </w:numPr>
+        <w:rPr>
+          <w:b/>
+          <w:bCs/>
+          <w:color w:val="FF0000"/>
+        </w:rPr>
+      </w:pPr>
+      <w:r>
+        <w:rPr>
+          <w:b/>
+          <w:bCs/>
+          <w:color w:val="FF0000"/>
+        </w:rPr>
+        <w:t>.editorconfig</w:t>
+      </w:r>
+    </w:p>
+    <w:p>
+      <w:r>
+        <w:t>The .editorconfig file is basically used to set the team environment, every developer in the team to follow the same coding standards which are defined in the .editorconfig file.</w:t>
+      </w:r>
+    </w:p>
+    <w:p>
+      <w:pPr>
+        <w:pStyle w:val="ListParagraph"/>
+        <w:numPr>
+          <w:ilvl w:val="0"/>
+          <w:numId w:val="1"/>
+        </w:numPr>
+        <w:rPr>
+          <w:b/>
+          <w:bCs/>
+          <w:color w:val="FF0000"/>
+        </w:rPr>
+      </w:pPr>
+      <w:r>
+        <w:rPr>
+          <w:b/>
+          <w:bCs/>
+          <w:color w:val="FF0000"/>
+        </w:rPr>
+        <w:t>Angular.json</w:t>
+      </w:r>
+    </w:p>
+    <w:p>
+      <w:r>
+        <w:t>The angular.json file contains all the configuration of the Angular application. Ex: assets, styles, script, entry point of the application, etc.</w:t>
+      </w:r>
+    </w:p>
+    <w:p/>
+    <w:p>
+      <w:pPr>
+        <w:pStyle w:val="ListParagraph"/>
+        <w:numPr>
+          <w:ilvl w:val="0"/>
+          <w:numId w:val="1"/>
+        </w:numPr>
+        <w:rPr>
+          <w:b/>
+          <w:bCs/>
+          <w:color w:val="FF0000"/>
+        </w:rPr>
+      </w:pPr>
+      <w:r>
+        <w:rPr>
+          <w:b/>
+          <w:bCs/>
+          <w:color w:val="FF0000"/>
+        </w:rPr>
+        <w:t>Package-lock.json</w:t>
+      </w:r>
+    </w:p>
+    <w:p>
+      <w:r>
+        <w:t xml:space="preserve">The package-lock.json contains the </w:t>
+      </w:r>
+      <w:r>
+        <w:t>exact version of every installed dependency including its sub dependencies and its versions.</w:t>
+      </w:r>
+    </w:p>
+    <w:p>
+      <w:r>
+        <w:t>The package-lock.json file ensures that install same dependencies consistently in every environment.</w:t>
+      </w:r>
+    </w:p>
+    <w:p/>
+    <w:p>
+      <w:pPr>
+        <w:pStyle w:val="ListParagraph"/>
+        <w:numPr>
+          <w:ilvl w:val="0"/>
+          <w:numId w:val="1"/>
+        </w:numPr>
+        <w:rPr>
+          <w:b/>
+          <w:bCs/>
+          <w:color w:val="FF0000"/>
+        </w:rPr>
+      </w:pPr>
+      <w:r>
+        <w:rPr>
+          <w:b/>
+          <w:bCs/>
+          <w:color w:val="FF0000"/>
+        </w:rPr>
+        <w:t>Tsconfig.json</w:t>
+      </w:r>
+    </w:p>
+    <w:p>
+      <w:r>
+        <w:t>The tsconfig.json file contains all the configurations of the typescript, while compiling the typescript code into the JavaScript code the compiler look into the tsconfig.json file and based on the settings defined in the tsconfig.json file it will compile from typescript file to JavaScript file.</w:t>
+      </w:r>
+    </w:p>
+    <w:p>
+      <w:pPr>
+        <w:pStyle w:val="ListParagraph"/>
+        <w:numPr>
+          <w:ilvl w:val="0"/>
+          <w:numId w:val="1"/>
+        </w:numPr>
+        <w:rPr>
+          <w:b/>
+          <w:bCs/>
+          <w:color w:val="FF0000"/>
+        </w:rPr>
+      </w:pPr>
+      <w:r>
+        <w:rPr>
+          <w:b/>
+          <w:bCs/>
+          <w:color w:val="FF0000"/>
+        </w:rPr>
+        <w:t>Main.ts</w:t>
+      </w:r>
+    </w:p>
+    <w:p>
+      <w:r>
+        <w:t xml:space="preserve">The main.ts is the starting point of the angular application, </w:t>
+      </w:r>
+      <w:r>
+        <w:t>the bootstrapping process of the angular application will start from the main.ts file.</w:t>
       </w:r>
     </w:p>
     <w:p>
@@ -147,6 +690,119 @@
 <file path=word/numbering.xml><?xml version="1.0" encoding="utf-8"?>
 <w:numbering xmlns:wpc="http://schemas.microsoft.com/office/word/2010/wordprocessingCanvas" xmlns:cx="http://schemas.microsoft.com/office/drawing/2014/chartex" xmlns:cx1="http://schemas.microsoft.com/office/drawing/2015/9/8/chartex" xmlns:cx2="http://schemas.microsoft.com/office/drawing/2015/10/21/chartex" xmlns:cx3="http://schemas.microsoft.com/office/drawing/2016/5/9/chartex" xmlns:cx4="http://schemas.microsoft.com/office/drawing/2016/5/10/chartex" xmlns:cx5="http://schemas.microsoft.com/office/drawing/2016/5/11/chartex" xmlns:cx6="http://schemas.microsoft.com/office/drawing/2016/5/12/chartex" xmlns:cx7="http://schemas.microsoft.com/office/drawing/2016/5/13/chartex" xmlns:cx8="http://schemas.microsoft.com/office/drawing/2016/5/14/chartex" xmlns:mc="http://schemas.openxmlformats.org/markup-compatibility/2006" xmlns:aink="http://schemas.microsoft.com/office/drawing/2016/ink" xmlns:am3d="http://schemas.microsoft.com/office/drawing/2017/model3d" xmlns:o="urn:schemas-microsoft-com:office:office" xmlns:oel="http://schemas.microsoft.com/office/2019/extlst" xmlns:r="http://schemas.openxmlformats.org/officeDocument/2006/relationships" xmlns:m="http://schemas.openxmlformats.org/officeDocument/2006/math" xmlns:v="urn:schemas-microsoft-com:vml" xmlns:wp14="http://schemas.microsoft.com/office/word/2010/wordprocessingDrawing" xmlns:wp="http://schemas.openxmlformats.org/drawingml/2006/wordprocessingDrawing" xmlns:w10="urn:schemas-microsoft-com:office:word" xmlns:w="http://schemas.openxmlformats.org/wordprocessingml/2006/main" xmlns:w14="http://schemas.microsoft.com/office/word/2010/wordml" xmlns:w15="http://schemas.microsoft.com/office/word/2012/wordml" xmlns:w16cex="http://schemas.microsoft.com/office/word/2018/wordml/cex" xmlns:w16cid="http://schemas.microsoft.com/office/word/2016/wordml/cid" xmlns:w16="http://schemas.microsoft.com/office/word/2018/wordml" xmlns:w16du="http://schemas.microsoft.com/office/word/2023/wordml/word16du" xmlns:w16sdtdh="http://schemas.microsoft.com/office/word/2020/wordml/sdtdatahash" xmlns:w16se="http://schemas.microsoft.com/office/word/2015/wordml/symex" xmlns:wpg="http://schemas.microsoft.com/office/word/2010/wordprocessingGroup" xmlns:wpi="http://schemas.microsoft.com/office/word/2010/wordprocessingInk" xmlns:wne="http://schemas.microsoft.com/office/word/2006/wordml" xmlns:wps="http://schemas.microsoft.com/office/word/2010/wordprocessingShape" mc:Ignorable="w14 w15 w16se w16cid w16 w16cex w16sdtdh w16du wp14">
   <w:abstractNum w:abstractNumId="0" w15:restartNumberingAfterBreak="0">
+    <w:nsid w:val="26CD42E5"/>
+    <w:multiLevelType w:val="hybridMultilevel"/>
+    <w:tmpl w:val="3BAA368C"/>
+    <w:lvl w:ilvl="0" w:tplc="40090001">
+      <w:start w:val="1"/>
+      <w:numFmt w:val="bullet"/>
+      <w:lvlText w:val=""/>
+      <w:lvlJc w:val="left"/>
+      <w:pPr>
+        <w:ind w:left="2160" w:hanging="360"/>
+      </w:pPr>
+      <w:rPr>
+        <w:rFonts w:ascii="Symbol" w:hAnsi="Symbol" w:hint="default"/>
+      </w:rPr>
+    </w:lvl>
+    <w:lvl w:ilvl="1" w:tplc="40090003" w:tentative="1">
+      <w:start w:val="1"/>
+      <w:numFmt w:val="bullet"/>
+      <w:lvlText w:val="o"/>
+      <w:lvlJc w:val="left"/>
+      <w:pPr>
+        <w:ind w:left="2880" w:hanging="360"/>
+      </w:pPr>
+      <w:rPr>
+        <w:rFonts w:ascii="Courier New" w:hAnsi="Courier New" w:cs="Courier New" w:hint="default"/>
+      </w:rPr>
+    </w:lvl>
+    <w:lvl w:ilvl="2" w:tplc="40090005" w:tentative="1">
+      <w:start w:val="1"/>
+      <w:numFmt w:val="bullet"/>
+      <w:lvlText w:val=""/>
+      <w:lvlJc w:val="left"/>
+      <w:pPr>
+        <w:ind w:left="3600" w:hanging="360"/>
+      </w:pPr>
+      <w:rPr>
+        <w:rFonts w:ascii="Wingdings" w:hAnsi="Wingdings" w:hint="default"/>
+      </w:rPr>
+    </w:lvl>
+    <w:lvl w:ilvl="3" w:tplc="40090001" w:tentative="1">
+      <w:start w:val="1"/>
+      <w:numFmt w:val="bullet"/>
+      <w:lvlText w:val=""/>
+      <w:lvlJc w:val="left"/>
+      <w:pPr>
+        <w:ind w:left="4320" w:hanging="360"/>
+      </w:pPr>
+      <w:rPr>
+        <w:rFonts w:ascii="Symbol" w:hAnsi="Symbol" w:hint="default"/>
+      </w:rPr>
+    </w:lvl>
+    <w:lvl w:ilvl="4" w:tplc="40090003" w:tentative="1">
+      <w:start w:val="1"/>
+      <w:numFmt w:val="bullet"/>
+      <w:lvlText w:val="o"/>
+      <w:lvlJc w:val="left"/>
+      <w:pPr>
+        <w:ind w:left="5040" w:hanging="360"/>
+      </w:pPr>
+      <w:rPr>
+        <w:rFonts w:ascii="Courier New" w:hAnsi="Courier New" w:cs="Courier New" w:hint="default"/>
+      </w:rPr>
+    </w:lvl>
+    <w:lvl w:ilvl="5" w:tplc="40090005" w:tentative="1">
+      <w:start w:val="1"/>
+      <w:numFmt w:val="bullet"/>
+      <w:lvlText w:val=""/>
+      <w:lvlJc w:val="left"/>
+      <w:pPr>
+        <w:ind w:left="5760" w:hanging="360"/>
+      </w:pPr>
+      <w:rPr>
+        <w:rFonts w:ascii="Wingdings" w:hAnsi="Wingdings" w:hint="default"/>
+      </w:rPr>
+    </w:lvl>
+    <w:lvl w:ilvl="6" w:tplc="40090001" w:tentative="1">
+      <w:start w:val="1"/>
+      <w:numFmt w:val="bullet"/>
+      <w:lvlText w:val=""/>
+      <w:lvlJc w:val="left"/>
+      <w:pPr>
+        <w:ind w:left="6480" w:hanging="360"/>
+      </w:pPr>
+      <w:rPr>
+        <w:rFonts w:ascii="Symbol" w:hAnsi="Symbol" w:hint="default"/>
+      </w:rPr>
+    </w:lvl>
+    <w:lvl w:ilvl="7" w:tplc="40090003" w:tentative="1">
+      <w:start w:val="1"/>
+      <w:numFmt w:val="bullet"/>
+      <w:lvlText w:val="o"/>
+      <w:lvlJc w:val="left"/>
+      <w:pPr>
+        <w:ind w:left="7200" w:hanging="360"/>
+      </w:pPr>
+      <w:rPr>
+        <w:rFonts w:ascii="Courier New" w:hAnsi="Courier New" w:cs="Courier New" w:hint="default"/>
+      </w:rPr>
+    </w:lvl>
+    <w:lvl w:ilvl="8" w:tplc="40090005" w:tentative="1">
+      <w:start w:val="1"/>
+      <w:numFmt w:val="bullet"/>
+      <w:lvlText w:val=""/>
+      <w:lvlJc w:val="left"/>
+      <w:pPr>
+        <w:ind w:left="7920" w:hanging="360"/>
+      </w:pPr>
+      <w:rPr>
+        <w:rFonts w:ascii="Wingdings" w:hAnsi="Wingdings" w:hint="default"/>
+      </w:rPr>
+    </w:lvl>
+  </w:abstractNum>
+  <w:abstractNum w:abstractNumId="1" w15:restartNumberingAfterBreak="0">
     <w:nsid w:val="605F5817"/>
     <w:multiLevelType w:val="hybridMultilevel"/>
     <w:tmpl w:val="5F48B142"/>
@@ -233,6 +889,9 @@
     </w:lvl>
   </w:abstractNum>
   <w:num w:numId="1" w16cid:durableId="980841899">
+    <w:abstractNumId w:val="1"/>
+  </w:num>
+  <w:num w:numId="2" w16cid:durableId="87431186">
     <w:abstractNumId w:val="0"/>
   </w:num>
 </w:numbering>

</xml_diff>

<commit_message>
property binding and attribute binding
</commit_message>
<xml_diff>
--- a/src/assets/documents/Angular-theory.docx
+++ b/src/assets/documents/Angular-theory.docx
@@ -1146,6 +1146,77 @@
     <w:p>
       <w:r>
         <w:t>With two-way data binding we can transfer the data from component class to its corresponding view template and view template to its corresponding component class at a time.</w:t>
+      </w:r>
+    </w:p>
+    <w:p>
+      <w:pPr>
+        <w:pStyle w:val="ListParagraph"/>
+        <w:numPr>
+          <w:ilvl w:val="0"/>
+          <w:numId w:val="1"/>
+        </w:numPr>
+        <w:rPr>
+          <w:b/>
+          <w:bCs/>
+          <w:color w:val="FF0000"/>
+        </w:rPr>
+      </w:pPr>
+      <w:r>
+        <w:rPr>
+          <w:b/>
+          <w:bCs/>
+          <w:color w:val="FF0000"/>
+        </w:rPr>
+        <w:t>what is the difference between the property and attribute binding in Angular?</w:t>
+      </w:r>
+    </w:p>
+    <w:p>
+      <w:r>
+        <w:lastRenderedPageBreak/>
+        <w:t>The property will represent the current value and it will be changed but the attribute represents the initial value and it could not be changed.</w:t>
+      </w:r>
+    </w:p>
+    <w:p>
+      <w:r>
+        <w:rPr>
+          <w:b/>
+          <w:bCs/>
+        </w:rPr>
+        <w:t>Attributes: aria-label, aria-hidden, aria-expanded, aria-control, data-id, data-name, data-value, Col span.</w:t>
+      </w:r>
+      <w:r>
+        <w:t xml:space="preserve"> </w:t>
+      </w:r>
+    </w:p>
+    <w:p/>
+    <w:p>
+      <w:pPr>
+        <w:rPr>
+          <w:b/>
+          <w:bCs/>
+        </w:rPr>
+      </w:pPr>
+      <w:r>
+        <w:rPr>
+          <w:b/>
+          <w:bCs/>
+        </w:rPr>
+        <w:t>property binding : &lt;img [src] = ‘../../assets/images/phone1.png’&gt;</w:t>
+      </w:r>
+    </w:p>
+    <w:p>
+      <w:pPr>
+        <w:rPr>
+          <w:b/>
+          <w:bCs/>
+        </w:rPr>
+      </w:pPr>
+      <w:r>
+        <w:rPr>
+          <w:b/>
+          <w:bCs/>
+        </w:rPr>
+        <w:t>attribute binding : &lt;button [attr.area-hidden] = “true”&gt;click me &lt;/button&gt;</w:t>
       </w:r>
     </w:p>
     <w:p>

</xml_diff>